<commit_message>
Refocus manuscript on transfer errors and scientific interpretation
</commit_message>
<xml_diff>
--- a/submission/highlights.docx
+++ b/submission/highlights.docx
@@ -1,156 +1,82 @@
 
 <file path=word/document.xml><?xml version="1.0" encoding="utf-8"?>
-<w:document xmlns:o="urn:schemas-microsoft-com:office:office" xmlns:r="http://schemas.openxmlformats.org/officeDocument/2006/relationships" xmlns:v="urn:schemas-microsoft-com:vml" xmlns:w="http://schemas.openxmlformats.org/wordprocessingml/2006/main" xmlns:w10="urn:schemas-microsoft-com:office:word" xmlns:wp="http://schemas.openxmlformats.org/drawingml/2006/wordprocessingDrawing" xmlns:wps="http://schemas.microsoft.com/office/word/2010/wordprocessingShape" xmlns:wpg="http://schemas.microsoft.com/office/word/2010/wordprocessingGroup" xmlns:mc="http://schemas.openxmlformats.org/markup-compatibility/2006" xmlns:wp14="http://schemas.microsoft.com/office/word/2010/wordprocessingDrawing" xmlns:w14="http://schemas.microsoft.com/office/word/2010/wordml" mc:Ignorable="w14 wp14">
-  <w:body>
-    <w:p>
-      <w:pPr>
-        <w:pStyle w:val="Corpodeltesto"/>
-        <w:bidi w:val="0"/>
-        <w:jc w:val="left"/>
-        <w:rPr>
-          <w:b/>
-        </w:rPr>
-      </w:pPr>
-      <w:r>
-        <w:rPr>
-          <w:b/>
-        </w:rPr>
-        <w:t>Highlights</w:t>
-      </w:r>
-    </w:p>
-    <w:p>
-      <w:pPr>
-        <w:pStyle w:val="Corpodeltesto"/>
-        <w:bidi w:val="0"/>
-        <w:spacing w:lineRule="auto" w:line="273" w:before="0" w:after="120"/>
-        <w:jc w:val="left"/>
-        <w:rPr/>
-      </w:pPr>
-      <w:r>
-        <w:rPr/>
-        <w:t>Mesh-to-Mesh Transfer Errors in Multistep Unsteady Flow Simulations</w:t>
-      </w:r>
-    </w:p>
-    <w:p>
-      <w:pPr>
-        <w:pStyle w:val="Corpodeltesto"/>
-        <w:numPr>
-          <w:ilvl w:val="0"/>
-          <w:numId w:val="1"/>
-        </w:numPr>
-        <w:tabs>
-          <w:tab w:val="clear" w:pos="709"/>
-          <w:tab w:val="left" w:pos="707" w:leader="none"/>
-        </w:tabs>
-        <w:bidi w:val="0"/>
-        <w:spacing w:before="0" w:after="0"/>
-        <w:ind w:left="707" w:hanging="283"/>
-        <w:jc w:val="left"/>
-        <w:rPr/>
-      </w:pPr>
-      <w:r>
-        <w:rPr/>
-        <w:t>Interpolation order, bounds and integral conservation require separate tests.</w:t>
-      </w:r>
-    </w:p>
-    <w:p>
-      <w:pPr>
-        <w:pStyle w:val="Corpodeltesto"/>
-        <w:numPr>
-          <w:ilvl w:val="0"/>
-          <w:numId w:val="1"/>
-        </w:numPr>
-        <w:tabs>
-          <w:tab w:val="clear" w:pos="709"/>
-          <w:tab w:val="left" w:pos="707" w:leader="none"/>
-        </w:tabs>
-        <w:bidi w:val="0"/>
-        <w:spacing w:before="0" w:after="0"/>
-        <w:ind w:left="707" w:hanging="283"/>
-        <w:jc w:val="left"/>
-        <w:rPr/>
-      </w:pPr>
-      <w:r>
-        <w:rPr/>
-        <w:t>Global correction preserves mass but does not recover a diffused profile.</w:t>
-      </w:r>
-    </w:p>
-    <w:p>
-      <w:pPr>
-        <w:pStyle w:val="Corpodeltesto"/>
-        <w:numPr>
-          <w:ilvl w:val="0"/>
-          <w:numId w:val="1"/>
-        </w:numPr>
-        <w:tabs>
-          <w:tab w:val="clear" w:pos="709"/>
-          <w:tab w:val="left" w:pos="707" w:leader="none"/>
-        </w:tabs>
-        <w:bidi w:val="0"/>
-        <w:spacing w:before="0" w:after="0"/>
-        <w:ind w:left="707" w:hanging="283"/>
-        <w:jc w:val="left"/>
-        <w:rPr/>
-      </w:pPr>
-      <w:r>
-        <w:rPr/>
-        <w:t>An older-history error perturbs the next step even when the latest is exact.</w:t>
-      </w:r>
-    </w:p>
-    <w:p>
-      <w:pPr>
-        <w:pStyle w:val="Corpodeltesto"/>
-        <w:numPr>
-          <w:ilvl w:val="0"/>
-          <w:numId w:val="1"/>
-        </w:numPr>
-        <w:tabs>
-          <w:tab w:val="clear" w:pos="709"/>
-          <w:tab w:val="left" w:pos="707" w:leader="none"/>
-        </w:tabs>
-        <w:bidi w:val="0"/>
-        <w:spacing w:before="0" w:after="0"/>
-        <w:ind w:left="707" w:hanging="283"/>
-        <w:jc w:val="left"/>
-        <w:rPr/>
-      </w:pPr>
-      <w:r>
-        <w:rPr/>
-        <w:t>Control-volume transfer preserves both the mass integral and the profile.</w:t>
-      </w:r>
-    </w:p>
-    <w:p>
-      <w:pPr>
-        <w:pStyle w:val="Corpodeltesto"/>
-        <w:numPr>
-          <w:ilvl w:val="0"/>
-          <w:numId w:val="1"/>
-        </w:numPr>
-        <w:tabs>
-          <w:tab w:val="clear" w:pos="709"/>
-          <w:tab w:val="left" w:pos="707" w:leader="none"/>
-        </w:tabs>
-        <w:bidi w:val="0"/>
-        <w:spacing w:before="0" w:after="120"/>
-        <w:ind w:left="707" w:hanging="283"/>
-        <w:jc w:val="left"/>
-        <w:rPr/>
-      </w:pPr>
-      <w:r>
-        <w:rPr/>
-        <w:t>A load ranking remains unresolved despite better integral preservation.</w:t>
-      </w:r>
-    </w:p>
-    <w:sectPr>
-      <w:type w:val="nextPage"/>
-      <w:pgSz w:w="11906" w:h="16838"/>
-      <w:pgMar w:left="1134" w:right="567" w:header="0" w:top="567" w:footer="0" w:bottom="567" w:gutter="0"/>
-      <w:pgNumType w:fmt="decimal"/>
-      <w:formProt w:val="false"/>
-      <w:textDirection w:val="lrTb"/>
-    </w:sectPr>
-  </w:body>
-</w:document>
+<ns0:document xmlns:ns0="http://schemas.openxmlformats.org/wordprocessingml/2006/main" xmlns:ns1="http://schemas.openxmlformats.org/markup-compatibility/2006" ns1:Ignorable="w14 wp14">
+  <ns0:body>
+    <ns0:p>
+      <ns0:pPr>
+        <ns0:pStyle ns0:val="Corpodeltesto"/>
+        <ns0:bidi ns0:val="0"/>
+        <ns0:jc ns0:val="left"/>
+        <ns0:rPr>
+          <ns0:b/>
+        </ns0:rPr>
+      </ns0:pPr>
+      <ns0:r>
+        <ns0:t>Interpolation order, bounds and integral conservation require separate tests.</ns0:t>
+      </ns0:r>
+    </ns0:p>
+    <ns0:p>
+      <ns0:pPr>
+        <ns0:pStyle ns0:val="Corpodeltesto"/>
+        <ns0:bidi ns0:val="0"/>
+        <ns0:jc ns0:val="left"/>
+        <ns0:rPr>
+          <ns0:b/>
+        </ns0:rPr>
+      </ns0:pPr>
+      <ns0:r>
+        <ns0:t>Global correction preserves mass but does not recover a diffused profile.</ns0:t>
+      </ns0:r>
+    </ns0:p>
+    <ns0:p>
+      <ns0:pPr>
+        <ns0:pStyle ns0:val="Corpodeltesto"/>
+        <ns0:bidi ns0:val="0"/>
+        <ns0:jc ns0:val="left"/>
+        <ns0:rPr>
+          <ns0:b/>
+        </ns0:rPr>
+      </ns0:pPr>
+      <ns0:r>
+        <ns0:t>An older-history error perturbs the next step even when the latest is exact.</ns0:t>
+      </ns0:r>
+    </ns0:p>
+    <ns0:p>
+      <ns0:pPr>
+        <ns0:pStyle ns0:val="Corpodeltesto"/>
+        <ns0:bidi ns0:val="0"/>
+        <ns0:jc ns0:val="left"/>
+        <ns0:rPr>
+          <ns0:b/>
+        </ns0:rPr>
+      </ns0:pPr>
+      <ns0:r>
+        <ns0:t>Control-volume transfer retains mass with little Euler transition broadening.</ns0:t>
+      </ns0:r>
+    </ns0:p>
+    <ns0:p>
+      <ns0:pPr>
+        <ns0:pStyle ns0:val="Corpodeltesto"/>
+        <ns0:bidi ns0:val="0"/>
+        <ns0:jc ns0:val="left"/>
+        <ns0:rPr>
+          <ns0:b/>
+        </ns0:rPr>
+      </ns0:pPr>
+      <ns0:r>
+        <ns0:t>A load ranking remains unresolved despite better integral preservation.</ns0:t>
+      </ns0:r>
+    </ns0:p>
+    <ns0:sectPr>
+      <ns0:type ns0:val="nextPage"/>
+      <ns0:pgSz ns0:w="11906" ns0:h="16838"/>
+      <ns0:pgMar ns0:left="1134" ns0:right="567" ns0:header="0" ns0:top="567" ns0:footer="0" ns0:bottom="567" ns0:gutter="0"/>
+      <ns0:pgNumType ns0:fmt="decimal"/>
+      <ns0:formProt ns0:val="false"/>
+      <ns0:textDirection ns0:val="lrTb"/>
+    </ns0:sectPr>
+  </ns0:body>
+</ns0:document>
 </file>
 
 <file path=word/numbering.xml><?xml version="1.0" encoding="utf-8"?>

</xml_diff>